<commit_message>
DAP QB Week 9 Ans FIx
</commit_message>
<xml_diff>
--- a/DAP - Data Analysis using Python/DAP_QB_ANS/DAP_QB_Week_9_Ans.docx
+++ b/DAP - Data Analysis using Python/DAP_QB_ANS/DAP_QB_Week_9_Ans.docx
@@ -706,16 +706,7 @@
                         <w:szCs w:val="28"/>
                         <w:lang w:val="en-IN"/>
                       </w:rPr>
-                      <m:t>(True Positives + False Negatives</m:t>
-                    </m:r>
-                    <m:r>
-                      <w:rPr>
-                        <w:rFonts w:ascii="Cambria Math" w:hAnsi="Cambria Math" w:cstheme="minorHAnsi"/>
-                        <w:sz w:val="28"/>
-                        <w:szCs w:val="28"/>
-                        <w:lang w:val="en-IN"/>
-                      </w:rPr>
-                      <m:t>)</m:t>
+                      <m:t>(True Positives + False Negatives)</m:t>
                     </m:r>
                   </m:den>
                 </m:f>
@@ -932,16 +923,7 @@
                     <w:szCs w:val="28"/>
                     <w:lang w:val="en-IN"/>
                   </w:rPr>
-                  <m:t xml:space="preserve"> </m:t>
-                </m:r>
-                <m:r>
-                  <w:rPr>
-                    <w:rFonts w:ascii="Cambria Math" w:hAnsi="Cambria Math" w:cstheme="minorHAnsi"/>
-                    <w:sz w:val="28"/>
-                    <w:szCs w:val="28"/>
-                    <w:lang w:val="en-IN"/>
-                  </w:rPr>
-                  <m:t xml:space="preserve">= </m:t>
+                  <m:t xml:space="preserve"> = </m:t>
                 </m:r>
                 <m:f>
                   <m:fPr>
@@ -985,16 +967,7 @@
                     <w:szCs w:val="28"/>
                     <w:lang w:val="en-IN"/>
                   </w:rPr>
-                  <m:t xml:space="preserve"> </m:t>
-                </m:r>
-                <m:r>
-                  <w:rPr>
-                    <w:rFonts w:ascii="Cambria Math" w:hAnsi="Cambria Math" w:cstheme="minorHAnsi"/>
-                    <w:sz w:val="28"/>
-                    <w:szCs w:val="28"/>
-                    <w:lang w:val="en-IN"/>
-                  </w:rPr>
-                  <m:t>= 0.8</m:t>
+                  <m:t xml:space="preserve"> = 0.8</m:t>
                 </m:r>
               </m:oMath>
             </m:oMathPara>
@@ -3515,7 +3488,6 @@
       <w:tblPr>
         <w:tblW w:w="11340" w:type="dxa"/>
         <w:tblInd w:w="-562" w:type="dxa"/>
-        <w:tblLayout w:type="fixed"/>
         <w:tblCellMar>
           <w:left w:w="0" w:type="dxa"/>
           <w:right w:w="0" w:type="dxa"/>
@@ -3591,7 +3563,7 @@
       </w:tr>
       <w:tr>
         <w:trPr>
-          <w:trHeight w:val="20"/>
+          <w:trHeight w:val="142"/>
         </w:trPr>
         <w:tc>
           <w:tcPr>
@@ -3634,8 +3606,565 @@
                 <w:rFonts w:asciiTheme="minorHAnsi" w:hAnsiTheme="minorHAnsi" w:cstheme="minorHAnsi"/>
                 <w:sz w:val="28"/>
                 <w:szCs w:val="28"/>
-              </w:rPr>
-            </w:pPr>
+                <w:lang w:val="en-IN"/>
+              </w:rPr>
+            </w:pPr>
+            <w:r>
+              <w:rPr>
+                <w:rFonts w:asciiTheme="minorHAnsi" w:hAnsiTheme="minorHAnsi" w:cstheme="minorHAnsi"/>
+                <w:sz w:val="28"/>
+                <w:szCs w:val="28"/>
+                <w:lang w:val="en-IN"/>
+              </w:rPr>
+              <w:t>To differentiate between Sensitivity and Specificity parameters for checking the type of error</w:t>
+            </w:r>
+          </w:p>
+          <w:p>
+            <w:pPr>
+              <w:pStyle w:val="TableParagraph"/>
+              <w:rPr>
+                <w:rFonts w:asciiTheme="minorHAnsi" w:hAnsiTheme="minorHAnsi" w:cstheme="minorHAnsi"/>
+                <w:sz w:val="28"/>
+                <w:szCs w:val="28"/>
+                <w:lang w:val="en-IN"/>
+              </w:rPr>
+            </w:pPr>
+          </w:p>
+          <w:tbl>
+            <w:tblPr>
+              <w:tblStyle w:val="TableGrid"/>
+              <w:tblW w:w="5000" w:type="pct"/>
+              <w:tblLook w:val="04A0" w:firstRow="1" w:lastRow="0" w:firstColumn="1" w:lastColumn="0" w:noHBand="0" w:noVBand="1"/>
+            </w:tblPr>
+            <w:tblGrid>
+              <w:gridCol w:w="1649"/>
+              <w:gridCol w:w="6590"/>
+              <w:gridCol w:w="2098"/>
+            </w:tblGrid>
+            <w:tr>
+              <w:tc>
+                <w:tcPr>
+                  <w:tcW w:w="591" w:type="pct"/>
+                  <w:noWrap/>
+                  <w:hideMark/>
+                </w:tcPr>
+                <w:p>
+                  <w:pPr>
+                    <w:pStyle w:val="TableParagraph"/>
+                    <w:rPr>
+                      <w:rFonts w:asciiTheme="minorHAnsi" w:hAnsiTheme="minorHAnsi" w:cstheme="minorHAnsi"/>
+                      <w:b/>
+                      <w:bCs/>
+                      <w:sz w:val="28"/>
+                      <w:szCs w:val="28"/>
+                      <w:lang w:val="en-IN"/>
+                    </w:rPr>
+                  </w:pPr>
+                  <w:r>
+                    <w:rPr>
+                      <w:rFonts w:asciiTheme="minorHAnsi" w:hAnsiTheme="minorHAnsi" w:cstheme="minorHAnsi"/>
+                      <w:b/>
+                      <w:bCs/>
+                      <w:sz w:val="28"/>
+                      <w:szCs w:val="28"/>
+                      <w:lang w:val="en-IN"/>
+                    </w:rPr>
+                    <w:t>Parameter</w:t>
+                  </w:r>
+                </w:p>
+              </w:tc>
+              <w:tc>
+                <w:tcPr>
+                  <w:tcW w:w="3291" w:type="pct"/>
+                  <w:noWrap/>
+                  <w:hideMark/>
+                </w:tcPr>
+                <w:p>
+                  <w:pPr>
+                    <w:pStyle w:val="TableParagraph"/>
+                    <w:rPr>
+                      <w:rFonts w:asciiTheme="minorHAnsi" w:hAnsiTheme="minorHAnsi" w:cstheme="minorHAnsi"/>
+                      <w:b/>
+                      <w:bCs/>
+                      <w:sz w:val="28"/>
+                      <w:szCs w:val="28"/>
+                      <w:lang w:val="en-IN"/>
+                    </w:rPr>
+                  </w:pPr>
+                  <w:r>
+                    <w:rPr>
+                      <w:rFonts w:asciiTheme="minorHAnsi" w:hAnsiTheme="minorHAnsi" w:cstheme="minorHAnsi"/>
+                      <w:b/>
+                      <w:bCs/>
+                      <w:sz w:val="28"/>
+                      <w:szCs w:val="28"/>
+                      <w:lang w:val="en-IN"/>
+                    </w:rPr>
+                    <w:t>Definition</w:t>
+                  </w:r>
+                </w:p>
+              </w:tc>
+              <w:tc>
+                <w:tcPr>
+                  <w:tcW w:w="1119" w:type="pct"/>
+                  <w:noWrap/>
+                  <w:hideMark/>
+                </w:tcPr>
+                <w:p>
+                  <w:pPr>
+                    <w:pStyle w:val="TableParagraph"/>
+                    <w:rPr>
+                      <w:rFonts w:asciiTheme="minorHAnsi" w:hAnsiTheme="minorHAnsi" w:cstheme="minorHAnsi"/>
+                      <w:b/>
+                      <w:bCs/>
+                      <w:sz w:val="28"/>
+                      <w:szCs w:val="28"/>
+                      <w:lang w:val="en-IN"/>
+                    </w:rPr>
+                  </w:pPr>
+                  <w:r>
+                    <w:rPr>
+                      <w:rFonts w:asciiTheme="minorHAnsi" w:hAnsiTheme="minorHAnsi" w:cstheme="minorHAnsi"/>
+                      <w:b/>
+                      <w:bCs/>
+                      <w:sz w:val="28"/>
+                      <w:szCs w:val="28"/>
+                      <w:lang w:val="en-IN"/>
+                    </w:rPr>
+                    <w:t>Calculation</w:t>
+                  </w:r>
+                </w:p>
+              </w:tc>
+            </w:tr>
+            <w:tr>
+              <w:tc>
+                <w:tcPr>
+                  <w:tcW w:w="591" w:type="pct"/>
+                  <w:hideMark/>
+                </w:tcPr>
+                <w:p>
+                  <w:pPr>
+                    <w:pStyle w:val="TableParagraph"/>
+                    <w:rPr>
+                      <w:rFonts w:asciiTheme="minorHAnsi" w:hAnsiTheme="minorHAnsi" w:cstheme="minorHAnsi"/>
+                      <w:sz w:val="28"/>
+                      <w:szCs w:val="28"/>
+                      <w:lang w:val="en-IN"/>
+                    </w:rPr>
+                  </w:pPr>
+                  <w:r>
+                    <w:rPr>
+                      <w:rFonts w:asciiTheme="minorHAnsi" w:hAnsiTheme="minorHAnsi" w:cstheme="minorHAnsi"/>
+                      <w:sz w:val="28"/>
+                      <w:szCs w:val="28"/>
+                      <w:lang w:val="en-IN"/>
+                    </w:rPr>
+                    <w:t>Sensitivity</w:t>
+                  </w:r>
+                </w:p>
+              </w:tc>
+              <w:tc>
+                <w:tcPr>
+                  <w:tcW w:w="3291" w:type="pct"/>
+                  <w:hideMark/>
+                </w:tcPr>
+                <w:p>
+                  <w:pPr>
+                    <w:pStyle w:val="TableParagraph"/>
+                    <w:rPr>
+                      <w:rFonts w:asciiTheme="minorHAnsi" w:hAnsiTheme="minorHAnsi" w:cstheme="minorHAnsi"/>
+                      <w:sz w:val="28"/>
+                      <w:szCs w:val="28"/>
+                      <w:lang w:val="en-IN"/>
+                    </w:rPr>
+                  </w:pPr>
+                  <w:r>
+                    <w:rPr>
+                      <w:rFonts w:asciiTheme="minorHAnsi" w:hAnsiTheme="minorHAnsi" w:cstheme="minorHAnsi"/>
+                      <w:sz w:val="28"/>
+                      <w:szCs w:val="28"/>
+                      <w:lang w:val="en-IN"/>
+                    </w:rPr>
+                    <w:t>Sensitivity (True Positive Rate) measures the proportion of actual positives correctly identified as such.</w:t>
+                  </w:r>
+                </w:p>
+              </w:tc>
+              <w:tc>
+                <w:tcPr>
+                  <w:tcW w:w="1119" w:type="pct"/>
+                  <w:hideMark/>
+                </w:tcPr>
+                <w:p>
+                  <w:pPr>
+                    <w:pStyle w:val="TableParagraph"/>
+                    <w:rPr>
+                      <w:rFonts w:asciiTheme="minorHAnsi" w:hAnsiTheme="minorHAnsi" w:cstheme="minorHAnsi"/>
+                      <w:sz w:val="28"/>
+                      <w:szCs w:val="28"/>
+                      <w:lang w:val="en-IN"/>
+                    </w:rPr>
+                  </w:pPr>
+                  <w:r>
+                    <w:rPr>
+                      <w:rFonts w:asciiTheme="minorHAnsi" w:hAnsiTheme="minorHAnsi" w:cstheme="minorHAnsi"/>
+                      <w:sz w:val="28"/>
+                      <w:szCs w:val="28"/>
+                      <w:lang w:val="en-IN"/>
+                    </w:rPr>
+                    <w:t>Sensitivity = TP / (TP + FN)</w:t>
+                  </w:r>
+                </w:p>
+              </w:tc>
+            </w:tr>
+            <w:tr>
+              <w:tc>
+                <w:tcPr>
+                  <w:tcW w:w="591" w:type="pct"/>
+                  <w:hideMark/>
+                </w:tcPr>
+                <w:p>
+                  <w:pPr>
+                    <w:pStyle w:val="TableParagraph"/>
+                    <w:rPr>
+                      <w:rFonts w:asciiTheme="minorHAnsi" w:hAnsiTheme="minorHAnsi" w:cstheme="minorHAnsi"/>
+                      <w:sz w:val="28"/>
+                      <w:szCs w:val="28"/>
+                      <w:lang w:val="en-IN"/>
+                    </w:rPr>
+                  </w:pPr>
+                  <w:r>
+                    <w:rPr>
+                      <w:rFonts w:asciiTheme="minorHAnsi" w:hAnsiTheme="minorHAnsi" w:cstheme="minorHAnsi"/>
+                      <w:sz w:val="28"/>
+                      <w:szCs w:val="28"/>
+                      <w:lang w:val="en-IN"/>
+                    </w:rPr>
+                    <w:t>Specificity</w:t>
+                  </w:r>
+                </w:p>
+              </w:tc>
+              <w:tc>
+                <w:tcPr>
+                  <w:tcW w:w="3291" w:type="pct"/>
+                  <w:hideMark/>
+                </w:tcPr>
+                <w:p>
+                  <w:pPr>
+                    <w:pStyle w:val="TableParagraph"/>
+                    <w:rPr>
+                      <w:rFonts w:asciiTheme="minorHAnsi" w:hAnsiTheme="minorHAnsi" w:cstheme="minorHAnsi"/>
+                      <w:sz w:val="28"/>
+                      <w:szCs w:val="28"/>
+                      <w:lang w:val="en-IN"/>
+                    </w:rPr>
+                  </w:pPr>
+                  <w:r>
+                    <w:rPr>
+                      <w:rFonts w:asciiTheme="minorHAnsi" w:hAnsiTheme="minorHAnsi" w:cstheme="minorHAnsi"/>
+                      <w:sz w:val="28"/>
+                      <w:szCs w:val="28"/>
+                      <w:lang w:val="en-IN"/>
+                    </w:rPr>
+                    <w:t>Specificity (True Negative Rate) measures the proportion of actual negatives correctly identified as such.</w:t>
+                  </w:r>
+                </w:p>
+              </w:tc>
+              <w:tc>
+                <w:tcPr>
+                  <w:tcW w:w="1119" w:type="pct"/>
+                  <w:hideMark/>
+                </w:tcPr>
+                <w:p>
+                  <w:pPr>
+                    <w:pStyle w:val="TableParagraph"/>
+                    <w:rPr>
+                      <w:rFonts w:asciiTheme="minorHAnsi" w:hAnsiTheme="minorHAnsi" w:cstheme="minorHAnsi"/>
+                      <w:sz w:val="28"/>
+                      <w:szCs w:val="28"/>
+                      <w:lang w:val="en-IN"/>
+                    </w:rPr>
+                  </w:pPr>
+                  <w:r>
+                    <w:rPr>
+                      <w:rFonts w:asciiTheme="minorHAnsi" w:hAnsiTheme="minorHAnsi" w:cstheme="minorHAnsi"/>
+                      <w:sz w:val="28"/>
+                      <w:szCs w:val="28"/>
+                      <w:lang w:val="en-IN"/>
+                    </w:rPr>
+                    <w:t>Specificity = TN / (TN + FP)</w:t>
+                  </w:r>
+                </w:p>
+              </w:tc>
+            </w:tr>
+          </w:tbl>
+          <w:p>
+            <w:pPr>
+              <w:pStyle w:val="TableParagraph"/>
+              <w:ind w:left="720"/>
+              <w:rPr>
+                <w:rFonts w:asciiTheme="minorHAnsi" w:hAnsiTheme="minorHAnsi" w:cstheme="minorHAnsi"/>
+                <w:sz w:val="28"/>
+                <w:szCs w:val="28"/>
+                <w:lang w:val="en-IN"/>
+              </w:rPr>
+            </w:pPr>
+          </w:p>
+          <w:p>
+            <w:pPr>
+              <w:pStyle w:val="TableParagraph"/>
+              <w:numPr>
+                <w:ilvl w:val="0"/>
+                <w:numId w:val="20"/>
+              </w:numPr>
+              <w:rPr>
+                <w:rFonts w:asciiTheme="minorHAnsi" w:hAnsiTheme="minorHAnsi" w:cstheme="minorHAnsi"/>
+                <w:sz w:val="28"/>
+                <w:szCs w:val="28"/>
+                <w:lang w:val="en-IN"/>
+              </w:rPr>
+            </w:pPr>
+            <w:r>
+              <w:rPr>
+                <w:rFonts w:asciiTheme="minorHAnsi" w:hAnsiTheme="minorHAnsi" w:cstheme="minorHAnsi"/>
+                <w:b/>
+                <w:bCs/>
+                <w:sz w:val="28"/>
+                <w:szCs w:val="28"/>
+                <w:lang w:val="en-IN"/>
+              </w:rPr>
+              <w:t>Sensitivity (True Positive Rate)</w:t>
+            </w:r>
+            <w:r>
+              <w:rPr>
+                <w:rFonts w:asciiTheme="minorHAnsi" w:hAnsiTheme="minorHAnsi" w:cstheme="minorHAnsi"/>
+                <w:sz w:val="28"/>
+                <w:szCs w:val="28"/>
+                <w:lang w:val="en-IN"/>
+              </w:rPr>
+              <w:t>:</w:t>
+            </w:r>
+          </w:p>
+          <w:p>
+            <w:pPr>
+              <w:pStyle w:val="TableParagraph"/>
+              <w:numPr>
+                <w:ilvl w:val="1"/>
+                <w:numId w:val="20"/>
+              </w:numPr>
+              <w:rPr>
+                <w:rFonts w:asciiTheme="minorHAnsi" w:hAnsiTheme="minorHAnsi" w:cstheme="minorHAnsi"/>
+                <w:sz w:val="28"/>
+                <w:szCs w:val="28"/>
+                <w:lang w:val="en-IN"/>
+              </w:rPr>
+            </w:pPr>
+            <w:r>
+              <w:rPr>
+                <w:rFonts w:asciiTheme="minorHAnsi" w:hAnsiTheme="minorHAnsi" w:cstheme="minorHAnsi"/>
+                <w:sz w:val="28"/>
+                <w:szCs w:val="28"/>
+                <w:lang w:val="en-IN"/>
+              </w:rPr>
+              <w:t>Sensitivity focuses on the ability of a test to correctly identify positive cases.</w:t>
+            </w:r>
+          </w:p>
+          <w:p>
+            <w:pPr>
+              <w:pStyle w:val="TableParagraph"/>
+              <w:numPr>
+                <w:ilvl w:val="1"/>
+                <w:numId w:val="20"/>
+              </w:numPr>
+              <w:rPr>
+                <w:rFonts w:asciiTheme="minorHAnsi" w:hAnsiTheme="minorHAnsi" w:cstheme="minorHAnsi"/>
+                <w:sz w:val="28"/>
+                <w:szCs w:val="28"/>
+                <w:lang w:val="en-IN"/>
+              </w:rPr>
+            </w:pPr>
+            <w:r>
+              <w:rPr>
+                <w:rFonts w:asciiTheme="minorHAnsi" w:hAnsiTheme="minorHAnsi" w:cstheme="minorHAnsi"/>
+                <w:sz w:val="28"/>
+                <w:szCs w:val="28"/>
+                <w:lang w:val="en-IN"/>
+              </w:rPr>
+              <w:t>It calculates the percentage of actual positive cases that were correctly identified as positive by the test.</w:t>
+            </w:r>
+          </w:p>
+          <w:p>
+            <w:pPr>
+              <w:pStyle w:val="TableParagraph"/>
+              <w:numPr>
+                <w:ilvl w:val="1"/>
+                <w:numId w:val="20"/>
+              </w:numPr>
+              <w:rPr>
+                <w:rFonts w:asciiTheme="minorHAnsi" w:hAnsiTheme="minorHAnsi" w:cstheme="minorHAnsi"/>
+                <w:sz w:val="28"/>
+                <w:szCs w:val="28"/>
+                <w:lang w:val="en-IN"/>
+              </w:rPr>
+            </w:pPr>
+            <w:r>
+              <w:rPr>
+                <w:rFonts w:asciiTheme="minorHAnsi" w:hAnsiTheme="minorHAnsi" w:cstheme="minorHAnsi"/>
+                <w:sz w:val="28"/>
+                <w:szCs w:val="28"/>
+                <w:lang w:val="en-IN"/>
+              </w:rPr>
+              <w:t>Formula: Sensitivity = True Positives / (True Positives + False Negatives)</w:t>
+            </w:r>
+          </w:p>
+          <w:p>
+            <w:pPr>
+              <w:pStyle w:val="TableParagraph"/>
+              <w:ind w:left="1440"/>
+              <w:rPr>
+                <w:rFonts w:asciiTheme="minorHAnsi" w:hAnsiTheme="minorHAnsi" w:cstheme="minorHAnsi"/>
+                <w:sz w:val="28"/>
+                <w:szCs w:val="28"/>
+                <w:lang w:val="en-IN"/>
+              </w:rPr>
+            </w:pPr>
+          </w:p>
+          <w:p>
+            <w:pPr>
+              <w:pStyle w:val="TableParagraph"/>
+              <w:numPr>
+                <w:ilvl w:val="0"/>
+                <w:numId w:val="20"/>
+              </w:numPr>
+              <w:rPr>
+                <w:rFonts w:asciiTheme="minorHAnsi" w:hAnsiTheme="minorHAnsi" w:cstheme="minorHAnsi"/>
+                <w:sz w:val="28"/>
+                <w:szCs w:val="28"/>
+                <w:lang w:val="en-IN"/>
+              </w:rPr>
+            </w:pPr>
+            <w:r>
+              <w:rPr>
+                <w:rFonts w:asciiTheme="minorHAnsi" w:hAnsiTheme="minorHAnsi" w:cstheme="minorHAnsi"/>
+                <w:b/>
+                <w:bCs/>
+                <w:sz w:val="28"/>
+                <w:szCs w:val="28"/>
+                <w:lang w:val="en-IN"/>
+              </w:rPr>
+              <w:t>Specificity (True Negative Rate)</w:t>
+            </w:r>
+            <w:r>
+              <w:rPr>
+                <w:rFonts w:asciiTheme="minorHAnsi" w:hAnsiTheme="minorHAnsi" w:cstheme="minorHAnsi"/>
+                <w:sz w:val="28"/>
+                <w:szCs w:val="28"/>
+                <w:lang w:val="en-IN"/>
+              </w:rPr>
+              <w:t>:</w:t>
+            </w:r>
+          </w:p>
+          <w:p>
+            <w:pPr>
+              <w:pStyle w:val="TableParagraph"/>
+              <w:numPr>
+                <w:ilvl w:val="1"/>
+                <w:numId w:val="20"/>
+              </w:numPr>
+              <w:rPr>
+                <w:rFonts w:asciiTheme="minorHAnsi" w:hAnsiTheme="minorHAnsi" w:cstheme="minorHAnsi"/>
+                <w:sz w:val="28"/>
+                <w:szCs w:val="28"/>
+                <w:lang w:val="en-IN"/>
+              </w:rPr>
+            </w:pPr>
+            <w:r>
+              <w:rPr>
+                <w:rFonts w:asciiTheme="minorHAnsi" w:hAnsiTheme="minorHAnsi" w:cstheme="minorHAnsi"/>
+                <w:sz w:val="28"/>
+                <w:szCs w:val="28"/>
+                <w:lang w:val="en-IN"/>
+              </w:rPr>
+              <w:t>Specificity emphasizes the ability of a test to correctly identify negative cases.</w:t>
+            </w:r>
+          </w:p>
+          <w:p>
+            <w:pPr>
+              <w:pStyle w:val="TableParagraph"/>
+              <w:numPr>
+                <w:ilvl w:val="1"/>
+                <w:numId w:val="20"/>
+              </w:numPr>
+              <w:rPr>
+                <w:rFonts w:asciiTheme="minorHAnsi" w:hAnsiTheme="minorHAnsi" w:cstheme="minorHAnsi"/>
+                <w:sz w:val="28"/>
+                <w:szCs w:val="28"/>
+                <w:lang w:val="en-IN"/>
+              </w:rPr>
+            </w:pPr>
+            <w:r>
+              <w:rPr>
+                <w:rFonts w:asciiTheme="minorHAnsi" w:hAnsiTheme="minorHAnsi" w:cstheme="minorHAnsi"/>
+                <w:sz w:val="28"/>
+                <w:szCs w:val="28"/>
+                <w:lang w:val="en-IN"/>
+              </w:rPr>
+              <w:t>It calculates the percentage of actual negative cases that were correctly identified as negative by the test.</w:t>
+            </w:r>
+          </w:p>
+          <w:p>
+            <w:pPr>
+              <w:pStyle w:val="TableParagraph"/>
+              <w:numPr>
+                <w:ilvl w:val="1"/>
+                <w:numId w:val="20"/>
+              </w:numPr>
+              <w:rPr>
+                <w:rFonts w:asciiTheme="minorHAnsi" w:hAnsiTheme="minorHAnsi" w:cstheme="minorHAnsi"/>
+                <w:sz w:val="28"/>
+                <w:szCs w:val="28"/>
+                <w:lang w:val="en-IN"/>
+              </w:rPr>
+            </w:pPr>
+            <w:r>
+              <w:rPr>
+                <w:rFonts w:asciiTheme="minorHAnsi" w:hAnsiTheme="minorHAnsi" w:cstheme="minorHAnsi"/>
+                <w:sz w:val="28"/>
+                <w:szCs w:val="28"/>
+                <w:lang w:val="en-IN"/>
+              </w:rPr>
+              <w:t>Formula: Specificity = True Negatives / (True Negatives + False Positives)</w:t>
+            </w:r>
+          </w:p>
+          <w:p>
+            <w:pPr>
+              <w:pStyle w:val="TableParagraph"/>
+              <w:ind w:left="1440"/>
+              <w:rPr>
+                <w:rFonts w:asciiTheme="minorHAnsi" w:hAnsiTheme="minorHAnsi" w:cstheme="minorHAnsi"/>
+                <w:sz w:val="28"/>
+                <w:szCs w:val="28"/>
+                <w:lang w:val="en-IN"/>
+              </w:rPr>
+            </w:pPr>
+          </w:p>
+          <w:p>
+            <w:pPr>
+              <w:pStyle w:val="TableParagraph"/>
+              <w:rPr>
+                <w:rFonts w:asciiTheme="minorHAnsi" w:hAnsiTheme="minorHAnsi" w:cstheme="minorHAnsi"/>
+                <w:sz w:val="28"/>
+                <w:szCs w:val="28"/>
+              </w:rPr>
+            </w:pPr>
+            <w:r>
+              <w:rPr>
+                <w:rFonts w:asciiTheme="minorHAnsi" w:hAnsiTheme="minorHAnsi" w:cstheme="minorHAnsi"/>
+                <w:sz w:val="28"/>
+                <w:szCs w:val="28"/>
+                <w:lang w:val="en-IN"/>
+              </w:rPr>
+              <w:t>In summary, sensitivity is concerned with the accurate detection of positive cases, while specificity focuses on correctly identifying negative cases. These parameters are crucial in evaluating the performance of classification models, especially in scenarios where different types of errors have varying consequences.</w:t>
+            </w:r>
           </w:p>
         </w:tc>
       </w:tr>
@@ -3654,7 +4183,7 @@
           <w:szCs w:val="28"/>
         </w:rPr>
         <w:sectPr>
-          <w:pgSz w:w="11913" w:h="11340"/>
+          <w:pgSz w:w="11913" w:h="11907"/>
           <w:pgMar w:top="142" w:right="573" w:bottom="278" w:left="697" w:header="720" w:footer="720" w:gutter="0"/>
           <w:cols w:space="720"/>
         </w:sectPr>
@@ -4471,6 +5000,17 @@
             </w:r>
             <w:r>
               <w:rPr>
+                <w:rFonts w:ascii="Cambria Math" w:hAnsi="Cambria Math" w:cs="Cambria Math"/>
+                <w:b/>
+                <w:bCs/>
+                <w:sz w:val="28"/>
+                <w:szCs w:val="28"/>
+                <w:lang w:val="en-IN"/>
+              </w:rPr>
+              <w:t xml:space="preserve"> </w:t>
+            </w:r>
+            <w:r>
+              <w:rPr>
                 <w:rFonts w:asciiTheme="minorHAnsi" w:hAnsiTheme="minorHAnsi" w:cstheme="minorHAnsi"/>
                 <w:b/>
                 <w:bCs/>
@@ -4479,6 +5019,17 @@
                 <w:lang w:val="en-IN"/>
               </w:rPr>
               <w:t>=</w:t>
+            </w:r>
+            <w:r>
+              <w:rPr>
+                <w:rFonts w:asciiTheme="minorHAnsi" w:hAnsiTheme="minorHAnsi" w:cstheme="minorHAnsi"/>
+                <w:b/>
+                <w:bCs/>
+                <w:sz w:val="28"/>
+                <w:szCs w:val="28"/>
+                <w:lang w:val="en-IN"/>
+              </w:rPr>
+              <w:t xml:space="preserve"> </w:t>
             </w:r>
             <w:r>
               <w:rPr>
@@ -4863,6 +5414,17 @@
             </w:r>
             <w:r>
               <w:rPr>
+                <w:rFonts w:ascii="Cambria Math" w:hAnsi="Cambria Math" w:cs="Cambria Math"/>
+                <w:b/>
+                <w:bCs/>
+                <w:sz w:val="28"/>
+                <w:szCs w:val="28"/>
+                <w:lang w:val="en-IN"/>
+              </w:rPr>
+              <w:t xml:space="preserve"> </w:t>
+            </w:r>
+            <w:r>
+              <w:rPr>
                 <w:rFonts w:asciiTheme="minorHAnsi" w:hAnsiTheme="minorHAnsi" w:cstheme="minorHAnsi"/>
                 <w:b/>
                 <w:bCs/>
@@ -4871,6 +5433,17 @@
                 <w:lang w:val="en-IN"/>
               </w:rPr>
               <w:t>=</w:t>
+            </w:r>
+            <w:r>
+              <w:rPr>
+                <w:rFonts w:asciiTheme="minorHAnsi" w:hAnsiTheme="minorHAnsi" w:cstheme="minorHAnsi"/>
+                <w:b/>
+                <w:bCs/>
+                <w:sz w:val="28"/>
+                <w:szCs w:val="28"/>
+                <w:lang w:val="en-IN"/>
+              </w:rPr>
+              <w:t xml:space="preserve"> </w:t>
             </w:r>
             <w:r>
               <w:rPr>
@@ -4900,45 +5473,12 @@
                 <w:rFonts w:asciiTheme="minorHAnsi" w:hAnsiTheme="minorHAnsi" w:cstheme="minorHAnsi"/>
                 <w:b/>
                 <w:bCs/>
-                <w:sz w:val="28"/>
-                <w:szCs w:val="28"/>
-                <w:lang w:val="en-IN"/>
-              </w:rPr>
-              <w:t>+</w:t>
-            </w:r>
-            <w:r>
-              <w:rPr>
-                <w:rFonts w:ascii="Cambria Math" w:hAnsi="Cambria Math" w:cs="Cambria Math"/>
-                <w:b/>
-                <w:bCs/>
-                <w:sz w:val="28"/>
-                <w:szCs w:val="28"/>
-                <w:lang w:val="en-IN"/>
-              </w:rPr>
-              <w:t>𝛽</w:t>
-            </w:r>
-            <w:r>
-              <w:rPr>
-                <w:rFonts w:asciiTheme="minorHAnsi" w:hAnsiTheme="minorHAnsi" w:cstheme="minorHAnsi"/>
-                <w:b/>
-                <w:bCs/>
                 <w:sz w:val="32"/>
                 <w:szCs w:val="32"/>
                 <w:vertAlign w:val="subscript"/>
                 <w:lang w:val="en-IN"/>
               </w:rPr>
-              <w:t>1</w:t>
-            </w:r>
-            <w:r>
-              <w:rPr>
-                <w:rFonts w:ascii="Cambria Math" w:hAnsi="Cambria Math" w:cs="Cambria Math"/>
-                <w:b/>
-                <w:bCs/>
-                <w:sz w:val="28"/>
-                <w:szCs w:val="28"/>
-                <w:lang w:val="en-IN"/>
-              </w:rPr>
-              <w:t>𝑥</w:t>
+              <w:t xml:space="preserve"> </w:t>
             </w:r>
             <w:r>
               <w:rPr>
@@ -4950,6 +5490,17 @@
                 <w:lang w:val="en-IN"/>
               </w:rPr>
               <w:t>+</w:t>
+            </w:r>
+            <w:r>
+              <w:rPr>
+                <w:rFonts w:asciiTheme="minorHAnsi" w:hAnsiTheme="minorHAnsi" w:cstheme="minorHAnsi"/>
+                <w:b/>
+                <w:bCs/>
+                <w:sz w:val="28"/>
+                <w:szCs w:val="28"/>
+                <w:lang w:val="en-IN"/>
+              </w:rPr>
+              <w:t xml:space="preserve"> </w:t>
             </w:r>
             <w:r>
               <w:rPr>
@@ -4972,7 +5523,98 @@
                 <w:vertAlign w:val="subscript"/>
                 <w:lang w:val="en-IN"/>
               </w:rPr>
+              <w:t>1</w:t>
+            </w:r>
+            <w:r>
+              <w:rPr>
+                <w:rFonts w:asciiTheme="minorHAnsi" w:hAnsiTheme="minorHAnsi" w:cstheme="minorHAnsi"/>
+                <w:b/>
+                <w:bCs/>
+                <w:sz w:val="32"/>
+                <w:szCs w:val="32"/>
+                <w:vertAlign w:val="subscript"/>
+                <w:lang w:val="en-IN"/>
+              </w:rPr>
+              <w:t xml:space="preserve"> </w:t>
+            </w:r>
+            <w:r>
+              <w:rPr>
+                <w:rFonts w:ascii="Cambria Math" w:hAnsi="Cambria Math" w:cs="Cambria Math"/>
+                <w:b/>
+                <w:bCs/>
+                <w:sz w:val="28"/>
+                <w:szCs w:val="28"/>
+                <w:lang w:val="en-IN"/>
+              </w:rPr>
+              <w:t>𝑥</w:t>
+            </w:r>
+            <w:r>
+              <w:rPr>
+                <w:rFonts w:ascii="Cambria Math" w:hAnsi="Cambria Math" w:cs="Cambria Math"/>
+                <w:b/>
+                <w:bCs/>
+                <w:sz w:val="28"/>
+                <w:szCs w:val="28"/>
+                <w:lang w:val="en-IN"/>
+              </w:rPr>
+              <w:t xml:space="preserve"> </w:t>
+            </w:r>
+            <w:r>
+              <w:rPr>
+                <w:rFonts w:asciiTheme="minorHAnsi" w:hAnsiTheme="minorHAnsi" w:cstheme="minorHAnsi"/>
+                <w:b/>
+                <w:bCs/>
+                <w:sz w:val="28"/>
+                <w:szCs w:val="28"/>
+                <w:lang w:val="en-IN"/>
+              </w:rPr>
+              <w:t>+</w:t>
+            </w:r>
+            <w:r>
+              <w:rPr>
+                <w:rFonts w:asciiTheme="minorHAnsi" w:hAnsiTheme="minorHAnsi" w:cstheme="minorHAnsi"/>
+                <w:b/>
+                <w:bCs/>
+                <w:sz w:val="28"/>
+                <w:szCs w:val="28"/>
+                <w:lang w:val="en-IN"/>
+              </w:rPr>
+              <w:t xml:space="preserve"> </w:t>
+            </w:r>
+            <w:r>
+              <w:rPr>
+                <w:rFonts w:ascii="Cambria Math" w:hAnsi="Cambria Math" w:cs="Cambria Math"/>
+                <w:b/>
+                <w:bCs/>
+                <w:sz w:val="28"/>
+                <w:szCs w:val="28"/>
+                <w:lang w:val="en-IN"/>
+              </w:rPr>
+              <w:t>𝛽</w:t>
+            </w:r>
+            <w:r>
+              <w:rPr>
+                <w:rFonts w:asciiTheme="minorHAnsi" w:hAnsiTheme="minorHAnsi" w:cstheme="minorHAnsi"/>
+                <w:b/>
+                <w:bCs/>
+                <w:sz w:val="32"/>
+                <w:szCs w:val="32"/>
+                <w:vertAlign w:val="subscript"/>
+                <w:lang w:val="en-IN"/>
+              </w:rPr>
               <w:t>2</w:t>
+            </w:r>
+            <w:r>
+              <w:rPr>
+                <w:rFonts w:asciiTheme="minorHAnsi" w:hAnsiTheme="minorHAnsi" w:cstheme="minorHAnsi"/>
+                <w:b/>
+                <w:bCs/>
+                <w:sz w:val="32"/>
+                <w:szCs w:val="32"/>
+                <w:vertAlign w:val="subscript"/>
+                <w:lang w:val="en-IN"/>
+              </w:rPr>
+              <w:t xml:space="preserve"> </w:t>
             </w:r>
             <w:r>
               <w:rPr>
@@ -7438,6 +8080,155 @@
     </w:lvl>
   </w:abstractNum>
   <w:abstractNum w:abstractNumId="14" w15:restartNumberingAfterBreak="0">
+    <w:nsid w:val="65A82514"/>
+    <w:multiLevelType w:val="multilevel"/>
+    <w:tmpl w:val="34563B70"/>
+    <w:lvl w:ilvl="0">
+      <w:start w:val="1"/>
+      <w:numFmt w:val="bullet"/>
+      <w:lvlText w:val=""/>
+      <w:lvlJc w:val="left"/>
+      <w:pPr>
+        <w:tabs>
+          <w:tab w:val="num" w:pos="720"/>
+        </w:tabs>
+        <w:ind w:left="720" w:hanging="360"/>
+      </w:pPr>
+      <w:rPr>
+        <w:rFonts w:ascii="Symbol" w:hAnsi="Symbol" w:hint="default"/>
+        <w:sz w:val="20"/>
+      </w:rPr>
+    </w:lvl>
+    <w:lvl w:ilvl="1">
+      <w:start w:val="1"/>
+      <w:numFmt w:val="bullet"/>
+      <w:lvlText w:val=""/>
+      <w:lvlJc w:val="left"/>
+      <w:pPr>
+        <w:tabs>
+          <w:tab w:val="num" w:pos="1440"/>
+        </w:tabs>
+        <w:ind w:left="1440" w:hanging="360"/>
+      </w:pPr>
+      <w:rPr>
+        <w:rFonts w:ascii="Symbol" w:hAnsi="Symbol" w:hint="default"/>
+        <w:sz w:val="20"/>
+      </w:rPr>
+    </w:lvl>
+    <w:lvl w:ilvl="2" w:tentative="1">
+      <w:start w:val="1"/>
+      <w:numFmt w:val="bullet"/>
+      <w:lvlText w:val=""/>
+      <w:lvlJc w:val="left"/>
+      <w:pPr>
+        <w:tabs>
+          <w:tab w:val="num" w:pos="2160"/>
+        </w:tabs>
+        <w:ind w:left="2160" w:hanging="360"/>
+      </w:pPr>
+      <w:rPr>
+        <w:rFonts w:ascii="Symbol" w:hAnsi="Symbol" w:hint="default"/>
+        <w:sz w:val="20"/>
+      </w:rPr>
+    </w:lvl>
+    <w:lvl w:ilvl="3" w:tentative="1">
+      <w:start w:val="1"/>
+      <w:numFmt w:val="bullet"/>
+      <w:lvlText w:val=""/>
+      <w:lvlJc w:val="left"/>
+      <w:pPr>
+        <w:tabs>
+          <w:tab w:val="num" w:pos="2880"/>
+        </w:tabs>
+        <w:ind w:left="2880" w:hanging="360"/>
+      </w:pPr>
+      <w:rPr>
+        <w:rFonts w:ascii="Symbol" w:hAnsi="Symbol" w:hint="default"/>
+        <w:sz w:val="20"/>
+      </w:rPr>
+    </w:lvl>
+    <w:lvl w:ilvl="4" w:tentative="1">
+      <w:start w:val="1"/>
+      <w:numFmt w:val="bullet"/>
+      <w:lvlText w:val=""/>
+      <w:lvlJc w:val="left"/>
+      <w:pPr>
+        <w:tabs>
+          <w:tab w:val="num" w:pos="3600"/>
+        </w:tabs>
+        <w:ind w:left="3600" w:hanging="360"/>
+      </w:pPr>
+      <w:rPr>
+        <w:rFonts w:ascii="Symbol" w:hAnsi="Symbol" w:hint="default"/>
+        <w:sz w:val="20"/>
+      </w:rPr>
+    </w:lvl>
+    <w:lvl w:ilvl="5" w:tentative="1">
+      <w:start w:val="1"/>
+      <w:numFmt w:val="bullet"/>
+      <w:lvlText w:val=""/>
+      <w:lvlJc w:val="left"/>
+      <w:pPr>
+        <w:tabs>
+          <w:tab w:val="num" w:pos="4320"/>
+        </w:tabs>
+        <w:ind w:left="4320" w:hanging="360"/>
+      </w:pPr>
+      <w:rPr>
+        <w:rFonts w:ascii="Symbol" w:hAnsi="Symbol" w:hint="default"/>
+        <w:sz w:val="20"/>
+      </w:rPr>
+    </w:lvl>
+    <w:lvl w:ilvl="6" w:tentative="1">
+      <w:start w:val="1"/>
+      <w:numFmt w:val="bullet"/>
+      <w:lvlText w:val=""/>
+      <w:lvlJc w:val="left"/>
+      <w:pPr>
+        <w:tabs>
+          <w:tab w:val="num" w:pos="5040"/>
+        </w:tabs>
+        <w:ind w:left="5040" w:hanging="360"/>
+      </w:pPr>
+      <w:rPr>
+        <w:rFonts w:ascii="Symbol" w:hAnsi="Symbol" w:hint="default"/>
+        <w:sz w:val="20"/>
+      </w:rPr>
+    </w:lvl>
+    <w:lvl w:ilvl="7" w:tentative="1">
+      <w:start w:val="1"/>
+      <w:numFmt w:val="bullet"/>
+      <w:lvlText w:val=""/>
+      <w:lvlJc w:val="left"/>
+      <w:pPr>
+        <w:tabs>
+          <w:tab w:val="num" w:pos="5760"/>
+        </w:tabs>
+        <w:ind w:left="5760" w:hanging="360"/>
+      </w:pPr>
+      <w:rPr>
+        <w:rFonts w:ascii="Symbol" w:hAnsi="Symbol" w:hint="default"/>
+        <w:sz w:val="20"/>
+      </w:rPr>
+    </w:lvl>
+    <w:lvl w:ilvl="8" w:tentative="1">
+      <w:start w:val="1"/>
+      <w:numFmt w:val="bullet"/>
+      <w:lvlText w:val=""/>
+      <w:lvlJc w:val="left"/>
+      <w:pPr>
+        <w:tabs>
+          <w:tab w:val="num" w:pos="6480"/>
+        </w:tabs>
+        <w:ind w:left="6480" w:hanging="360"/>
+      </w:pPr>
+      <w:rPr>
+        <w:rFonts w:ascii="Symbol" w:hAnsi="Symbol" w:hint="default"/>
+        <w:sz w:val="20"/>
+      </w:rPr>
+    </w:lvl>
+  </w:abstractNum>
+  <w:abstractNum w:abstractNumId="15" w15:restartNumberingAfterBreak="0">
     <w:nsid w:val="67F73CF5"/>
     <w:multiLevelType w:val="multilevel"/>
     <w:tmpl w:val="A996930E"/>
@@ -7550,7 +8341,7 @@
       </w:pPr>
     </w:lvl>
   </w:abstractNum>
-  <w:abstractNum w:abstractNumId="15" w15:restartNumberingAfterBreak="0">
+  <w:abstractNum w:abstractNumId="16" w15:restartNumberingAfterBreak="0">
     <w:nsid w:val="68803345"/>
     <w:multiLevelType w:val="multilevel"/>
     <w:tmpl w:val="28D6E090"/>
@@ -7663,7 +8454,7 @@
       </w:pPr>
     </w:lvl>
   </w:abstractNum>
-  <w:abstractNum w:abstractNumId="16" w15:restartNumberingAfterBreak="0">
+  <w:abstractNum w:abstractNumId="17" w15:restartNumberingAfterBreak="0">
     <w:nsid w:val="701077D8"/>
     <w:multiLevelType w:val="multilevel"/>
     <w:tmpl w:val="ECC834A8"/>
@@ -7776,7 +8567,7 @@
       </w:pPr>
     </w:lvl>
   </w:abstractNum>
-  <w:abstractNum w:abstractNumId="17" w15:restartNumberingAfterBreak="0">
+  <w:abstractNum w:abstractNumId="18" w15:restartNumberingAfterBreak="0">
     <w:nsid w:val="716B56B3"/>
     <w:multiLevelType w:val="multilevel"/>
     <w:tmpl w:val="B26A3DEA"/>
@@ -7889,7 +8680,7 @@
       </w:pPr>
     </w:lvl>
   </w:abstractNum>
-  <w:abstractNum w:abstractNumId="18" w15:restartNumberingAfterBreak="0">
+  <w:abstractNum w:abstractNumId="19" w15:restartNumberingAfterBreak="0">
     <w:nsid w:val="78105E8D"/>
     <w:multiLevelType w:val="multilevel"/>
     <w:tmpl w:val="3904A9E2"/>
@@ -8010,10 +8801,10 @@
     <w:abstractNumId w:val="10"/>
   </w:num>
   <w:num w:numId="2" w16cid:durableId="1234924971">
-    <w:abstractNumId w:val="16"/>
+    <w:abstractNumId w:val="17"/>
   </w:num>
   <w:num w:numId="3" w16cid:durableId="2038726092">
-    <w:abstractNumId w:val="14"/>
+    <w:abstractNumId w:val="15"/>
   </w:num>
   <w:num w:numId="4" w16cid:durableId="1726174041">
     <w:abstractNumId w:val="7"/>
@@ -8025,7 +8816,7 @@
     <w:abstractNumId w:val="1"/>
   </w:num>
   <w:num w:numId="7" w16cid:durableId="1207568512">
-    <w:abstractNumId w:val="17"/>
+    <w:abstractNumId w:val="18"/>
   </w:num>
   <w:num w:numId="8" w16cid:durableId="1855878255">
     <w:abstractNumId w:val="6"/>
@@ -8043,13 +8834,13 @@
     <w:abstractNumId w:val="2"/>
   </w:num>
   <w:num w:numId="13" w16cid:durableId="1907916708">
-    <w:abstractNumId w:val="18"/>
+    <w:abstractNumId w:val="19"/>
   </w:num>
   <w:num w:numId="14" w16cid:durableId="1462571116">
     <w:abstractNumId w:val="0"/>
   </w:num>
   <w:num w:numId="15" w16cid:durableId="1002851805">
-    <w:abstractNumId w:val="15"/>
+    <w:abstractNumId w:val="16"/>
   </w:num>
   <w:num w:numId="16" w16cid:durableId="1639872741">
     <w:abstractNumId w:val="13"/>
@@ -8062,6 +8853,9 @@
   </w:num>
   <w:num w:numId="19" w16cid:durableId="321742922">
     <w:abstractNumId w:val="11"/>
+  </w:num>
+  <w:num w:numId="20" w16cid:durableId="1150561832">
+    <w:abstractNumId w:val="14"/>
   </w:num>
 </w:numbering>
 </file>

</xml_diff>